<commit_message>
Publish sixteen measured Linux impairment scenarios and final evaluation report
</commit_message>
<xml_diff>
--- a/artifacts/FYP_Streaming_Initial_Evaluation.docx
+++ b/artifacts/FYP_Streaming_Initial_Evaluation.docx
@@ -41,6 +41,11 @@
     <w:p>
       <w:r>
         <w:t>os: Microsoft Windows 11 Home</w:t>
+      </w:r>
+    </w:p>
+    <w:p>
+      <w:r>
+        <w:t>Linux SFU: Node v22.23.4, mediasoup 3.31.0, x64, kernel 6.18.40.1-microsoft-standard-WSL2. Exact image ID and server-source checksum are in linux-environment.json.</w:t>
       </w:r>
     </w:p>
     <w:p>
@@ -103,17 +108,7 @@
           </w:tcPr>
           <w:p>
             <w:r>
-              <w:t>Client</w:t>
-            </w:r>
-          </w:p>
-        </w:tc>
-        <w:tc>
-          <w:tcPr>
-            <w:tcW w:type="dxa" w:w="1234"/>
-          </w:tcPr>
-          <w:p>
-            <w:r>
-              <w:t>Samples</w:t>
+              <w:t>Outcome</w:t>
             </w:r>
           </w:p>
         </w:tc>
@@ -133,7 +128,7 @@
           </w:tcPr>
           <w:p>
             <w:r>
-              <w:t>ICE RTT p95 ms</w:t>
+              <w:t>Video FPS</w:t>
             </w:r>
           </w:p>
         </w:tc>
@@ -143,7 +138,17 @@
           </w:tcPr>
           <w:p>
             <w:r>
-              <w:t>Video FPS</w:t>
+              <w:t>SFU CPU %</w:t>
+            </w:r>
+          </w:p>
+        </w:tc>
+        <w:tc>
+          <w:tcPr>
+            <w:tcW w:type="dxa" w:w="1234"/>
+          </w:tcPr>
+          <w:p>
+            <w:r>
+              <w:t>Node RSS MiB</w:t>
             </w:r>
           </w:p>
         </w:tc>
@@ -155,7 +160,151 @@
           </w:tcPr>
           <w:p>
             <w:r>
-              <w:t>h264 / video-frame-timer</w:t>
+              <w:t>h264</w:t>
+            </w:r>
+          </w:p>
+        </w:tc>
+        <w:tc>
+          <w:tcPr>
+            <w:tcW w:type="dxa" w:w="1234"/>
+          </w:tcPr>
+          <w:p>
+            <w:r>
+              <w:t>2</w:t>
+            </w:r>
+          </w:p>
+        </w:tc>
+        <w:tc>
+          <w:tcPr>
+            <w:tcW w:type="dxa" w:w="1234"/>
+          </w:tcPr>
+          <w:p>
+            <w:r>
+              <w:t>PASS</w:t>
+            </w:r>
+          </w:p>
+        </w:tc>
+        <w:tc>
+          <w:tcPr>
+            <w:tcW w:type="dxa" w:w="1234"/>
+          </w:tcPr>
+          <w:p>
+            <w:r>
+              <w:t>169.43</w:t>
+            </w:r>
+          </w:p>
+        </w:tc>
+        <w:tc>
+          <w:tcPr>
+            <w:tcW w:type="dxa" w:w="1234"/>
+          </w:tcPr>
+          <w:p>
+            <w:r>
+              <w:t>29.76</w:t>
+            </w:r>
+          </w:p>
+        </w:tc>
+        <w:tc>
+          <w:tcPr>
+            <w:tcW w:type="dxa" w:w="1234"/>
+          </w:tcPr>
+          <w:p>
+            <w:r>
+              <w:t>0.70</w:t>
+            </w:r>
+          </w:p>
+        </w:tc>
+        <w:tc>
+          <w:tcPr>
+            <w:tcW w:type="dxa" w:w="1234"/>
+          </w:tcPr>
+          <w:p>
+            <w:r>
+              <w:t>33.34</w:t>
+            </w:r>
+          </w:p>
+        </w:tc>
+      </w:tr>
+      <w:tr>
+        <w:tc>
+          <w:tcPr>
+            <w:tcW w:type="dxa" w:w="1234"/>
+          </w:tcPr>
+          <w:p>
+            <w:r>
+              <w:t>h264</w:t>
+            </w:r>
+          </w:p>
+        </w:tc>
+        <w:tc>
+          <w:tcPr>
+            <w:tcW w:type="dxa" w:w="1234"/>
+          </w:tcPr>
+          <w:p>
+            <w:r>
+              <w:t>4</w:t>
+            </w:r>
+          </w:p>
+        </w:tc>
+        <w:tc>
+          <w:tcPr>
+            <w:tcW w:type="dxa" w:w="1234"/>
+          </w:tcPr>
+          <w:p>
+            <w:r>
+              <w:t>PASS</w:t>
+            </w:r>
+          </w:p>
+        </w:tc>
+        <w:tc>
+          <w:tcPr>
+            <w:tcW w:type="dxa" w:w="1234"/>
+          </w:tcPr>
+          <w:p>
+            <w:r>
+              <w:t>171.18</w:t>
+            </w:r>
+          </w:p>
+        </w:tc>
+        <w:tc>
+          <w:tcPr>
+            <w:tcW w:type="dxa" w:w="1234"/>
+          </w:tcPr>
+          <w:p>
+            <w:r>
+              <w:t>30.13</w:t>
+            </w:r>
+          </w:p>
+        </w:tc>
+        <w:tc>
+          <w:tcPr>
+            <w:tcW w:type="dxa" w:w="1234"/>
+          </w:tcPr>
+          <w:p>
+            <w:r>
+              <w:t>1.96</w:t>
+            </w:r>
+          </w:p>
+        </w:tc>
+        <w:tc>
+          <w:tcPr>
+            <w:tcW w:type="dxa" w:w="1234"/>
+          </w:tcPr>
+          <w:p>
+            <w:r>
+              <w:t>33.36</w:t>
+            </w:r>
+          </w:p>
+        </w:tc>
+      </w:tr>
+      <w:tr>
+        <w:tc>
+          <w:tcPr>
+            <w:tcW w:type="dxa" w:w="1234"/>
+          </w:tcPr>
+          <w:p>
+            <w:r>
+              <w:t>h264</w:t>
             </w:r>
           </w:p>
         </w:tc>
@@ -175,7 +324,7 @@
           </w:tcPr>
           <w:p>
             <w:r>
-              <w:t>peer-0</w:t>
+              <w:t>PASS</w:t>
             </w:r>
           </w:p>
         </w:tc>
@@ -185,7 +334,7 @@
           </w:tcPr>
           <w:p>
             <w:r>
-              <w:t>36</w:t>
+              <w:t>172.29</w:t>
             </w:r>
           </w:p>
         </w:tc>
@@ -195,7 +344,7 @@
           </w:tcPr>
           <w:p>
             <w:r>
-              <w:t>170.13</w:t>
+              <w:t>29.14</w:t>
             </w:r>
           </w:p>
         </w:tc>
@@ -205,7 +354,7 @@
           </w:tcPr>
           <w:p>
             <w:r>
-              <w:t>17.00</w:t>
+              <w:t>12.49</w:t>
             </w:r>
           </w:p>
         </w:tc>
@@ -215,7 +364,7 @@
           </w:tcPr>
           <w:p>
             <w:r>
-              <w:t>29.38</w:t>
+              <w:t>30.08</w:t>
             </w:r>
           </w:p>
         </w:tc>
@@ -227,367 +376,7 @@
           </w:tcPr>
           <w:p>
             <w:r>
-              <w:t>h264 / video-frame-timer</w:t>
-            </w:r>
-          </w:p>
-        </w:tc>
-        <w:tc>
-          <w:tcPr>
-            <w:tcW w:type="dxa" w:w="1234"/>
-          </w:tcPr>
-          <w:p>
-            <w:r>
-              <w:t>6</w:t>
-            </w:r>
-          </w:p>
-        </w:tc>
-        <w:tc>
-          <w:tcPr>
-            <w:tcW w:type="dxa" w:w="1234"/>
-          </w:tcPr>
-          <w:p>
-            <w:r>
-              <w:t>peer-1</w:t>
-            </w:r>
-          </w:p>
-        </w:tc>
-        <w:tc>
-          <w:tcPr>
-            <w:tcW w:type="dxa" w:w="1234"/>
-          </w:tcPr>
-          <w:p>
-            <w:r>
-              <w:t>38</w:t>
-            </w:r>
-          </w:p>
-        </w:tc>
-        <w:tc>
-          <w:tcPr>
-            <w:tcW w:type="dxa" w:w="1234"/>
-          </w:tcPr>
-          <w:p>
-            <w:r>
-              <w:t>171.29</w:t>
-            </w:r>
-          </w:p>
-        </w:tc>
-        <w:tc>
-          <w:tcPr>
-            <w:tcW w:type="dxa" w:w="1234"/>
-          </w:tcPr>
-          <w:p>
-            <w:r>
-              <w:t>7.00</w:t>
-            </w:r>
-          </w:p>
-        </w:tc>
-        <w:tc>
-          <w:tcPr>
-            <w:tcW w:type="dxa" w:w="1234"/>
-          </w:tcPr>
-          <w:p>
-            <w:r>
-              <w:t>29.33</w:t>
-            </w:r>
-          </w:p>
-        </w:tc>
-      </w:tr>
-      <w:tr>
-        <w:tc>
-          <w:tcPr>
-            <w:tcW w:type="dxa" w:w="1234"/>
-          </w:tcPr>
-          <w:p>
-            <w:r>
-              <w:t>h264 / video-frame-timer</w:t>
-            </w:r>
-          </w:p>
-        </w:tc>
-        <w:tc>
-          <w:tcPr>
-            <w:tcW w:type="dxa" w:w="1234"/>
-          </w:tcPr>
-          <w:p>
-            <w:r>
-              <w:t>6</w:t>
-            </w:r>
-          </w:p>
-        </w:tc>
-        <w:tc>
-          <w:tcPr>
-            <w:tcW w:type="dxa" w:w="1234"/>
-          </w:tcPr>
-          <w:p>
-            <w:r>
-              <w:t>peer-2</w:t>
-            </w:r>
-          </w:p>
-        </w:tc>
-        <w:tc>
-          <w:tcPr>
-            <w:tcW w:type="dxa" w:w="1234"/>
-          </w:tcPr>
-          <w:p>
-            <w:r>
-              <w:t>40</w:t>
-            </w:r>
-          </w:p>
-        </w:tc>
-        <w:tc>
-          <w:tcPr>
-            <w:tcW w:type="dxa" w:w="1234"/>
-          </w:tcPr>
-          <w:p>
-            <w:r>
-              <w:t>167.56</w:t>
-            </w:r>
-          </w:p>
-        </w:tc>
-        <w:tc>
-          <w:tcPr>
-            <w:tcW w:type="dxa" w:w="1234"/>
-          </w:tcPr>
-          <w:p>
-            <w:r>
-              <w:t>39.00</w:t>
-            </w:r>
-          </w:p>
-        </w:tc>
-        <w:tc>
-          <w:tcPr>
-            <w:tcW w:type="dxa" w:w="1234"/>
-          </w:tcPr>
-          <w:p>
-            <w:r>
-              <w:t>29.17</w:t>
-            </w:r>
-          </w:p>
-        </w:tc>
-      </w:tr>
-      <w:tr>
-        <w:tc>
-          <w:tcPr>
-            <w:tcW w:type="dxa" w:w="1234"/>
-          </w:tcPr>
-          <w:p>
-            <w:r>
-              <w:t>h264 / video-frame-timer</w:t>
-            </w:r>
-          </w:p>
-        </w:tc>
-        <w:tc>
-          <w:tcPr>
-            <w:tcW w:type="dxa" w:w="1234"/>
-          </w:tcPr>
-          <w:p>
-            <w:r>
-              <w:t>6</w:t>
-            </w:r>
-          </w:p>
-        </w:tc>
-        <w:tc>
-          <w:tcPr>
-            <w:tcW w:type="dxa" w:w="1234"/>
-          </w:tcPr>
-          <w:p>
-            <w:r>
-              <w:t>peer-3</w:t>
-            </w:r>
-          </w:p>
-        </w:tc>
-        <w:tc>
-          <w:tcPr>
-            <w:tcW w:type="dxa" w:w="1234"/>
-          </w:tcPr>
-          <w:p>
-            <w:r>
-              <w:t>41</w:t>
-            </w:r>
-          </w:p>
-        </w:tc>
-        <w:tc>
-          <w:tcPr>
-            <w:tcW w:type="dxa" w:w="1234"/>
-          </w:tcPr>
-          <w:p>
-            <w:r>
-              <w:t>172.23</w:t>
-            </w:r>
-          </w:p>
-        </w:tc>
-        <w:tc>
-          <w:tcPr>
-            <w:tcW w:type="dxa" w:w="1234"/>
-          </w:tcPr>
-          <w:p>
-            <w:r>
-              <w:t>9.00</w:t>
-            </w:r>
-          </w:p>
-        </w:tc>
-        <w:tc>
-          <w:tcPr>
-            <w:tcW w:type="dxa" w:w="1234"/>
-          </w:tcPr>
-          <w:p>
-            <w:r>
-              <w:t>29.07</w:t>
-            </w:r>
-          </w:p>
-        </w:tc>
-      </w:tr>
-      <w:tr>
-        <w:tc>
-          <w:tcPr>
-            <w:tcW w:type="dxa" w:w="1234"/>
-          </w:tcPr>
-          <w:p>
-            <w:r>
-              <w:t>h264 / video-frame-timer</w:t>
-            </w:r>
-          </w:p>
-        </w:tc>
-        <w:tc>
-          <w:tcPr>
-            <w:tcW w:type="dxa" w:w="1234"/>
-          </w:tcPr>
-          <w:p>
-            <w:r>
-              <w:t>6</w:t>
-            </w:r>
-          </w:p>
-        </w:tc>
-        <w:tc>
-          <w:tcPr>
-            <w:tcW w:type="dxa" w:w="1234"/>
-          </w:tcPr>
-          <w:p>
-            <w:r>
-              <w:t>peer-4</w:t>
-            </w:r>
-          </w:p>
-        </w:tc>
-        <w:tc>
-          <w:tcPr>
-            <w:tcW w:type="dxa" w:w="1234"/>
-          </w:tcPr>
-          <w:p>
-            <w:r>
-              <w:t>44</w:t>
-            </w:r>
-          </w:p>
-        </w:tc>
-        <w:tc>
-          <w:tcPr>
-            <w:tcW w:type="dxa" w:w="1234"/>
-          </w:tcPr>
-          <w:p>
-            <w:r>
-              <w:t>168.62</w:t>
-            </w:r>
-          </w:p>
-        </w:tc>
-        <w:tc>
-          <w:tcPr>
-            <w:tcW w:type="dxa" w:w="1234"/>
-          </w:tcPr>
-          <w:p>
-            <w:r>
-              <w:t>8.00</w:t>
-            </w:r>
-          </w:p>
-        </w:tc>
-        <w:tc>
-          <w:tcPr>
-            <w:tcW w:type="dxa" w:w="1234"/>
-          </w:tcPr>
-          <w:p>
-            <w:r>
-              <w:t>28.95</w:t>
-            </w:r>
-          </w:p>
-        </w:tc>
-      </w:tr>
-      <w:tr>
-        <w:tc>
-          <w:tcPr>
-            <w:tcW w:type="dxa" w:w="1234"/>
-          </w:tcPr>
-          <w:p>
-            <w:r>
-              <w:t>h264 / video-frame-timer</w:t>
-            </w:r>
-          </w:p>
-        </w:tc>
-        <w:tc>
-          <w:tcPr>
-            <w:tcW w:type="dxa" w:w="1234"/>
-          </w:tcPr>
-          <w:p>
-            <w:r>
-              <w:t>6</w:t>
-            </w:r>
-          </w:p>
-        </w:tc>
-        <w:tc>
-          <w:tcPr>
-            <w:tcW w:type="dxa" w:w="1234"/>
-          </w:tcPr>
-          <w:p>
-            <w:r>
-              <w:t>peer-5</w:t>
-            </w:r>
-          </w:p>
-        </w:tc>
-        <w:tc>
-          <w:tcPr>
-            <w:tcW w:type="dxa" w:w="1234"/>
-          </w:tcPr>
-          <w:p>
-            <w:r>
-              <w:t>46</w:t>
-            </w:r>
-          </w:p>
-        </w:tc>
-        <w:tc>
-          <w:tcPr>
-            <w:tcW w:type="dxa" w:w="1234"/>
-          </w:tcPr>
-          <w:p>
-            <w:r>
-              <w:t>183.89</w:t>
-            </w:r>
-          </w:p>
-        </w:tc>
-        <w:tc>
-          <w:tcPr>
-            <w:tcW w:type="dxa" w:w="1234"/>
-          </w:tcPr>
-          <w:p>
-            <w:r>
-              <w:t>9.00</w:t>
-            </w:r>
-          </w:p>
-        </w:tc>
-        <w:tc>
-          <w:tcPr>
-            <w:tcW w:type="dxa" w:w="1234"/>
-          </w:tcPr>
-          <w:p>
-            <w:r>
-              <w:t>28.96</w:t>
-            </w:r>
-          </w:p>
-        </w:tc>
-      </w:tr>
-      <w:tr>
-        <w:tc>
-          <w:tcPr>
-            <w:tcW w:type="dxa" w:w="1234"/>
-          </w:tcPr>
-          <w:p>
-            <w:r>
-              <w:t>h264 / video-frame-timer</w:t>
+              <w:t>h264</w:t>
             </w:r>
           </w:p>
         </w:tc>
@@ -607,7 +396,7 @@
           </w:tcPr>
           <w:p>
             <w:r>
-              <w:t>peer-0</w:t>
+              <w:t>PASS</w:t>
             </w:r>
           </w:p>
         </w:tc>
@@ -617,7 +406,7 @@
           </w:tcPr>
           <w:p>
             <w:r>
-              <w:t>39</w:t>
+              <w:t>163.48</w:t>
             </w:r>
           </w:p>
         </w:tc>
@@ -627,7 +416,7 @@
           </w:tcPr>
           <w:p>
             <w:r>
-              <w:t>165.09</w:t>
+              <w:t>27.76</w:t>
             </w:r>
           </w:p>
         </w:tc>
@@ -637,7 +426,7 @@
           </w:tcPr>
           <w:p>
             <w:r>
-              <w:t>34.00</w:t>
+              <w:t>18.53</w:t>
             </w:r>
           </w:p>
         </w:tc>
@@ -647,7 +436,7 @@
           </w:tcPr>
           <w:p>
             <w:r>
-              <w:t>27.81</w:t>
+              <w:t>32.37</w:t>
             </w:r>
           </w:p>
         </w:tc>
@@ -659,511 +448,7 @@
           </w:tcPr>
           <w:p>
             <w:r>
-              <w:t>h264 / video-frame-timer</w:t>
-            </w:r>
-          </w:p>
-        </w:tc>
-        <w:tc>
-          <w:tcPr>
-            <w:tcW w:type="dxa" w:w="1234"/>
-          </w:tcPr>
-          <w:p>
-            <w:r>
-              <w:t>8</w:t>
-            </w:r>
-          </w:p>
-        </w:tc>
-        <w:tc>
-          <w:tcPr>
-            <w:tcW w:type="dxa" w:w="1234"/>
-          </w:tcPr>
-          <w:p>
-            <w:r>
-              <w:t>peer-1</w:t>
-            </w:r>
-          </w:p>
-        </w:tc>
-        <w:tc>
-          <w:tcPr>
-            <w:tcW w:type="dxa" w:w="1234"/>
-          </w:tcPr>
-          <w:p>
-            <w:r>
-              <w:t>40</w:t>
-            </w:r>
-          </w:p>
-        </w:tc>
-        <w:tc>
-          <w:tcPr>
-            <w:tcW w:type="dxa" w:w="1234"/>
-          </w:tcPr>
-          <w:p>
-            <w:r>
-              <w:t>166.09</w:t>
-            </w:r>
-          </w:p>
-        </w:tc>
-        <w:tc>
-          <w:tcPr>
-            <w:tcW w:type="dxa" w:w="1234"/>
-          </w:tcPr>
-          <w:p>
-            <w:r>
-              <w:t>8.00</w:t>
-            </w:r>
-          </w:p>
-        </w:tc>
-        <w:tc>
-          <w:tcPr>
-            <w:tcW w:type="dxa" w:w="1234"/>
-          </w:tcPr>
-          <w:p>
-            <w:r>
-              <w:t>27.99</w:t>
-            </w:r>
-          </w:p>
-        </w:tc>
-      </w:tr>
-      <w:tr>
-        <w:tc>
-          <w:tcPr>
-            <w:tcW w:type="dxa" w:w="1234"/>
-          </w:tcPr>
-          <w:p>
-            <w:r>
-              <w:t>h264 / video-frame-timer</w:t>
-            </w:r>
-          </w:p>
-        </w:tc>
-        <w:tc>
-          <w:tcPr>
-            <w:tcW w:type="dxa" w:w="1234"/>
-          </w:tcPr>
-          <w:p>
-            <w:r>
-              <w:t>8</w:t>
-            </w:r>
-          </w:p>
-        </w:tc>
-        <w:tc>
-          <w:tcPr>
-            <w:tcW w:type="dxa" w:w="1234"/>
-          </w:tcPr>
-          <w:p>
-            <w:r>
-              <w:t>peer-2</w:t>
-            </w:r>
-          </w:p>
-        </w:tc>
-        <w:tc>
-          <w:tcPr>
-            <w:tcW w:type="dxa" w:w="1234"/>
-          </w:tcPr>
-          <w:p>
-            <w:r>
-              <w:t>41</w:t>
-            </w:r>
-          </w:p>
-        </w:tc>
-        <w:tc>
-          <w:tcPr>
-            <w:tcW w:type="dxa" w:w="1234"/>
-          </w:tcPr>
-          <w:p>
-            <w:r>
-              <w:t>161.14</w:t>
-            </w:r>
-          </w:p>
-        </w:tc>
-        <w:tc>
-          <w:tcPr>
-            <w:tcW w:type="dxa" w:w="1234"/>
-          </w:tcPr>
-          <w:p>
-            <w:r>
-              <w:t>9.00</w:t>
-            </w:r>
-          </w:p>
-        </w:tc>
-        <w:tc>
-          <w:tcPr>
-            <w:tcW w:type="dxa" w:w="1234"/>
-          </w:tcPr>
-          <w:p>
-            <w:r>
-              <w:t>27.70</w:t>
-            </w:r>
-          </w:p>
-        </w:tc>
-      </w:tr>
-      <w:tr>
-        <w:tc>
-          <w:tcPr>
-            <w:tcW w:type="dxa" w:w="1234"/>
-          </w:tcPr>
-          <w:p>
-            <w:r>
-              <w:t>h264 / video-frame-timer</w:t>
-            </w:r>
-          </w:p>
-        </w:tc>
-        <w:tc>
-          <w:tcPr>
-            <w:tcW w:type="dxa" w:w="1234"/>
-          </w:tcPr>
-          <w:p>
-            <w:r>
-              <w:t>8</w:t>
-            </w:r>
-          </w:p>
-        </w:tc>
-        <w:tc>
-          <w:tcPr>
-            <w:tcW w:type="dxa" w:w="1234"/>
-          </w:tcPr>
-          <w:p>
-            <w:r>
-              <w:t>peer-3</w:t>
-            </w:r>
-          </w:p>
-        </w:tc>
-        <w:tc>
-          <w:tcPr>
-            <w:tcW w:type="dxa" w:w="1234"/>
-          </w:tcPr>
-          <w:p>
-            <w:r>
-              <w:t>43</w:t>
-            </w:r>
-          </w:p>
-        </w:tc>
-        <w:tc>
-          <w:tcPr>
-            <w:tcW w:type="dxa" w:w="1234"/>
-          </w:tcPr>
-          <w:p>
-            <w:r>
-              <w:t>162.02</w:t>
-            </w:r>
-          </w:p>
-        </w:tc>
-        <w:tc>
-          <w:tcPr>
-            <w:tcW w:type="dxa" w:w="1234"/>
-          </w:tcPr>
-          <w:p>
-            <w:r>
-              <w:t>15.00</w:t>
-            </w:r>
-          </w:p>
-        </w:tc>
-        <w:tc>
-          <w:tcPr>
-            <w:tcW w:type="dxa" w:w="1234"/>
-          </w:tcPr>
-          <w:p>
-            <w:r>
-              <w:t>27.74</w:t>
-            </w:r>
-          </w:p>
-        </w:tc>
-      </w:tr>
-      <w:tr>
-        <w:tc>
-          <w:tcPr>
-            <w:tcW w:type="dxa" w:w="1234"/>
-          </w:tcPr>
-          <w:p>
-            <w:r>
-              <w:t>h264 / video-frame-timer</w:t>
-            </w:r>
-          </w:p>
-        </w:tc>
-        <w:tc>
-          <w:tcPr>
-            <w:tcW w:type="dxa" w:w="1234"/>
-          </w:tcPr>
-          <w:p>
-            <w:r>
-              <w:t>8</w:t>
-            </w:r>
-          </w:p>
-        </w:tc>
-        <w:tc>
-          <w:tcPr>
-            <w:tcW w:type="dxa" w:w="1234"/>
-          </w:tcPr>
-          <w:p>
-            <w:r>
-              <w:t>peer-4</w:t>
-            </w:r>
-          </w:p>
-        </w:tc>
-        <w:tc>
-          <w:tcPr>
-            <w:tcW w:type="dxa" w:w="1234"/>
-          </w:tcPr>
-          <w:p>
-            <w:r>
-              <w:t>44</w:t>
-            </w:r>
-          </w:p>
-        </w:tc>
-        <w:tc>
-          <w:tcPr>
-            <w:tcW w:type="dxa" w:w="1234"/>
-          </w:tcPr>
-          <w:p>
-            <w:r>
-              <w:t>163.34</w:t>
-            </w:r>
-          </w:p>
-        </w:tc>
-        <w:tc>
-          <w:tcPr>
-            <w:tcW w:type="dxa" w:w="1234"/>
-          </w:tcPr>
-          <w:p>
-            <w:r>
-              <w:t>11.65</w:t>
-            </w:r>
-          </w:p>
-        </w:tc>
-        <w:tc>
-          <w:tcPr>
-            <w:tcW w:type="dxa" w:w="1234"/>
-          </w:tcPr>
-          <w:p>
-            <w:r>
-              <w:t>27.60</w:t>
-            </w:r>
-          </w:p>
-        </w:tc>
-      </w:tr>
-      <w:tr>
-        <w:tc>
-          <w:tcPr>
-            <w:tcW w:type="dxa" w:w="1234"/>
-          </w:tcPr>
-          <w:p>
-            <w:r>
-              <w:t>h264 / video-frame-timer</w:t>
-            </w:r>
-          </w:p>
-        </w:tc>
-        <w:tc>
-          <w:tcPr>
-            <w:tcW w:type="dxa" w:w="1234"/>
-          </w:tcPr>
-          <w:p>
-            <w:r>
-              <w:t>8</w:t>
-            </w:r>
-          </w:p>
-        </w:tc>
-        <w:tc>
-          <w:tcPr>
-            <w:tcW w:type="dxa" w:w="1234"/>
-          </w:tcPr>
-          <w:p>
-            <w:r>
-              <w:t>peer-5</w:t>
-            </w:r>
-          </w:p>
-        </w:tc>
-        <w:tc>
-          <w:tcPr>
-            <w:tcW w:type="dxa" w:w="1234"/>
-          </w:tcPr>
-          <w:p>
-            <w:r>
-              <w:t>46</w:t>
-            </w:r>
-          </w:p>
-        </w:tc>
-        <w:tc>
-          <w:tcPr>
-            <w:tcW w:type="dxa" w:w="1234"/>
-          </w:tcPr>
-          <w:p>
-            <w:r>
-              <w:t>163.01</w:t>
-            </w:r>
-          </w:p>
-        </w:tc>
-        <w:tc>
-          <w:tcPr>
-            <w:tcW w:type="dxa" w:w="1234"/>
-          </w:tcPr>
-          <w:p>
-            <w:r>
-              <w:t>66.70</w:t>
-            </w:r>
-          </w:p>
-        </w:tc>
-        <w:tc>
-          <w:tcPr>
-            <w:tcW w:type="dxa" w:w="1234"/>
-          </w:tcPr>
-          <w:p>
-            <w:r>
-              <w:t>27.78</w:t>
-            </w:r>
-          </w:p>
-        </w:tc>
-      </w:tr>
-      <w:tr>
-        <w:tc>
-          <w:tcPr>
-            <w:tcW w:type="dxa" w:w="1234"/>
-          </w:tcPr>
-          <w:p>
-            <w:r>
-              <w:t>h264 / video-frame-timer</w:t>
-            </w:r>
-          </w:p>
-        </w:tc>
-        <w:tc>
-          <w:tcPr>
-            <w:tcW w:type="dxa" w:w="1234"/>
-          </w:tcPr>
-          <w:p>
-            <w:r>
-              <w:t>8</w:t>
-            </w:r>
-          </w:p>
-        </w:tc>
-        <w:tc>
-          <w:tcPr>
-            <w:tcW w:type="dxa" w:w="1234"/>
-          </w:tcPr>
-          <w:p>
-            <w:r>
-              <w:t>peer-6</w:t>
-            </w:r>
-          </w:p>
-        </w:tc>
-        <w:tc>
-          <w:tcPr>
-            <w:tcW w:type="dxa" w:w="1234"/>
-          </w:tcPr>
-          <w:p>
-            <w:r>
-              <w:t>47</w:t>
-            </w:r>
-          </w:p>
-        </w:tc>
-        <w:tc>
-          <w:tcPr>
-            <w:tcW w:type="dxa" w:w="1234"/>
-          </w:tcPr>
-          <w:p>
-            <w:r>
-              <w:t>163.43</w:t>
-            </w:r>
-          </w:p>
-        </w:tc>
-        <w:tc>
-          <w:tcPr>
-            <w:tcW w:type="dxa" w:w="1234"/>
-          </w:tcPr>
-          <w:p>
-            <w:r>
-              <w:t>13.20</w:t>
-            </w:r>
-          </w:p>
-        </w:tc>
-        <w:tc>
-          <w:tcPr>
-            <w:tcW w:type="dxa" w:w="1234"/>
-          </w:tcPr>
-          <w:p>
-            <w:r>
-              <w:t>27.79</w:t>
-            </w:r>
-          </w:p>
-        </w:tc>
-      </w:tr>
-      <w:tr>
-        <w:tc>
-          <w:tcPr>
-            <w:tcW w:type="dxa" w:w="1234"/>
-          </w:tcPr>
-          <w:p>
-            <w:r>
-              <w:t>h264 / video-frame-timer</w:t>
-            </w:r>
-          </w:p>
-        </w:tc>
-        <w:tc>
-          <w:tcPr>
-            <w:tcW w:type="dxa" w:w="1234"/>
-          </w:tcPr>
-          <w:p>
-            <w:r>
-              <w:t>8</w:t>
-            </w:r>
-          </w:p>
-        </w:tc>
-        <w:tc>
-          <w:tcPr>
-            <w:tcW w:type="dxa" w:w="1234"/>
-          </w:tcPr>
-          <w:p>
-            <w:r>
-              <w:t>peer-7</w:t>
-            </w:r>
-          </w:p>
-        </w:tc>
-        <w:tc>
-          <w:tcPr>
-            <w:tcW w:type="dxa" w:w="1234"/>
-          </w:tcPr>
-          <w:p>
-            <w:r>
-              <w:t>47</w:t>
-            </w:r>
-          </w:p>
-        </w:tc>
-        <w:tc>
-          <w:tcPr>
-            <w:tcW w:type="dxa" w:w="1234"/>
-          </w:tcPr>
-          <w:p>
-            <w:r>
-              <w:t>163.73</w:t>
-            </w:r>
-          </w:p>
-        </w:tc>
-        <w:tc>
-          <w:tcPr>
-            <w:tcW w:type="dxa" w:w="1234"/>
-          </w:tcPr>
-          <w:p>
-            <w:r>
-              <w:t>13.40</w:t>
-            </w:r>
-          </w:p>
-        </w:tc>
-        <w:tc>
-          <w:tcPr>
-            <w:tcW w:type="dxa" w:w="1234"/>
-          </w:tcPr>
-          <w:p>
-            <w:r>
-              <w:t>27.69</w:t>
-            </w:r>
-          </w:p>
-        </w:tc>
-      </w:tr>
-      <w:tr>
-        <w:tc>
-          <w:tcPr>
-            <w:tcW w:type="dxa" w:w="1234"/>
-          </w:tcPr>
-          <w:p>
-            <w:r>
-              <w:t>h264 / video-frame-timer</w:t>
+              <w:t>simulcast</w:t>
             </w:r>
           </w:p>
         </w:tc>
@@ -1183,7 +468,7 @@
           </w:tcPr>
           <w:p>
             <w:r>
-              <w:t>peer-0</w:t>
+              <w:t>PASS</w:t>
             </w:r>
           </w:p>
         </w:tc>
@@ -1193,7 +478,7 @@
           </w:tcPr>
           <w:p>
             <w:r>
-              <w:t>32</w:t>
+              <w:t>263.97</w:t>
             </w:r>
           </w:p>
         </w:tc>
@@ -1203,7 +488,7 @@
           </w:tcPr>
           <w:p>
             <w:r>
-              <w:t>166.79</w:t>
+              <w:t>29.04</w:t>
             </w:r>
           </w:p>
         </w:tc>
@@ -1213,7 +498,7 @@
           </w:tcPr>
           <w:p>
             <w:r>
-              <w:t>2.00</w:t>
+              <w:t>1.61</w:t>
             </w:r>
           </w:p>
         </w:tc>
@@ -1223,7 +508,7 @@
           </w:tcPr>
           <w:p>
             <w:r>
-              <w:t>30.26</w:t>
+              <w:t>33.45</w:t>
             </w:r>
           </w:p>
         </w:tc>
@@ -1235,7 +520,7 @@
           </w:tcPr>
           <w:p>
             <w:r>
-              <w:t>h264 / video-frame-timer</w:t>
+              <w:t>vp9</w:t>
             </w:r>
           </w:p>
         </w:tc>
@@ -1255,7 +540,7 @@
           </w:tcPr>
           <w:p>
             <w:r>
-              <w:t>peer-1</w:t>
+              <w:t>PASS</w:t>
             </w:r>
           </w:p>
         </w:tc>
@@ -1265,7 +550,7 @@
           </w:tcPr>
           <w:p>
             <w:r>
-              <w:t>31</w:t>
+              <w:t>412.68</w:t>
             </w:r>
           </w:p>
         </w:tc>
@@ -1275,7 +560,7 @@
           </w:tcPr>
           <w:p>
             <w:r>
-              <w:t>172.08</w:t>
+              <w:t>29.75</w:t>
             </w:r>
           </w:p>
         </w:tc>
@@ -1285,7 +570,7 @@
           </w:tcPr>
           <w:p>
             <w:r>
-              <w:t>1.00</w:t>
+              <w:t>0.96</w:t>
             </w:r>
           </w:p>
         </w:tc>
@@ -1295,583 +580,7 @@
           </w:tcPr>
           <w:p>
             <w:r>
-              <w:t>29.27</w:t>
-            </w:r>
-          </w:p>
-        </w:tc>
-      </w:tr>
-      <w:tr>
-        <w:tc>
-          <w:tcPr>
-            <w:tcW w:type="dxa" w:w="1234"/>
-          </w:tcPr>
-          <w:p>
-            <w:r>
-              <w:t>h264 / video-frame-timer</w:t>
-            </w:r>
-          </w:p>
-        </w:tc>
-        <w:tc>
-          <w:tcPr>
-            <w:tcW w:type="dxa" w:w="1234"/>
-          </w:tcPr>
-          <w:p>
-            <w:r>
-              <w:t>4</w:t>
-            </w:r>
-          </w:p>
-        </w:tc>
-        <w:tc>
-          <w:tcPr>
-            <w:tcW w:type="dxa" w:w="1234"/>
-          </w:tcPr>
-          <w:p>
-            <w:r>
-              <w:t>peer-0</w:t>
-            </w:r>
-          </w:p>
-        </w:tc>
-        <w:tc>
-          <w:tcPr>
-            <w:tcW w:type="dxa" w:w="1234"/>
-          </w:tcPr>
-          <w:p>
-            <w:r>
-              <w:t>33</w:t>
-            </w:r>
-          </w:p>
-        </w:tc>
-        <w:tc>
-          <w:tcPr>
-            <w:tcW w:type="dxa" w:w="1234"/>
-          </w:tcPr>
-          <w:p>
-            <w:r>
-              <w:t>167.24</w:t>
-            </w:r>
-          </w:p>
-        </w:tc>
-        <w:tc>
-          <w:tcPr>
-            <w:tcW w:type="dxa" w:w="1234"/>
-          </w:tcPr>
-          <w:p>
-            <w:r>
-              <w:t>4.00</w:t>
-            </w:r>
-          </w:p>
-        </w:tc>
-        <w:tc>
-          <w:tcPr>
-            <w:tcW w:type="dxa" w:w="1234"/>
-          </w:tcPr>
-          <w:p>
-            <w:r>
-              <w:t>30.32</w:t>
-            </w:r>
-          </w:p>
-        </w:tc>
-      </w:tr>
-      <w:tr>
-        <w:tc>
-          <w:tcPr>
-            <w:tcW w:type="dxa" w:w="1234"/>
-          </w:tcPr>
-          <w:p>
-            <w:r>
-              <w:t>h264 / video-frame-timer</w:t>
-            </w:r>
-          </w:p>
-        </w:tc>
-        <w:tc>
-          <w:tcPr>
-            <w:tcW w:type="dxa" w:w="1234"/>
-          </w:tcPr>
-          <w:p>
-            <w:r>
-              <w:t>4</w:t>
-            </w:r>
-          </w:p>
-        </w:tc>
-        <w:tc>
-          <w:tcPr>
-            <w:tcW w:type="dxa" w:w="1234"/>
-          </w:tcPr>
-          <w:p>
-            <w:r>
-              <w:t>peer-1</w:t>
-            </w:r>
-          </w:p>
-        </w:tc>
-        <w:tc>
-          <w:tcPr>
-            <w:tcW w:type="dxa" w:w="1234"/>
-          </w:tcPr>
-          <w:p>
-            <w:r>
-              <w:t>33</w:t>
-            </w:r>
-          </w:p>
-        </w:tc>
-        <w:tc>
-          <w:tcPr>
-            <w:tcW w:type="dxa" w:w="1234"/>
-          </w:tcPr>
-          <w:p>
-            <w:r>
-              <w:t>172.73</w:t>
-            </w:r>
-          </w:p>
-        </w:tc>
-        <w:tc>
-          <w:tcPr>
-            <w:tcW w:type="dxa" w:w="1234"/>
-          </w:tcPr>
-          <w:p>
-            <w:r>
-              <w:t>5.00</w:t>
-            </w:r>
-          </w:p>
-        </w:tc>
-        <w:tc>
-          <w:tcPr>
-            <w:tcW w:type="dxa" w:w="1234"/>
-          </w:tcPr>
-          <w:p>
-            <w:r>
-              <w:t>30.15</w:t>
-            </w:r>
-          </w:p>
-        </w:tc>
-      </w:tr>
-      <w:tr>
-        <w:tc>
-          <w:tcPr>
-            <w:tcW w:type="dxa" w:w="1234"/>
-          </w:tcPr>
-          <w:p>
-            <w:r>
-              <w:t>h264 / video-frame-timer</w:t>
-            </w:r>
-          </w:p>
-        </w:tc>
-        <w:tc>
-          <w:tcPr>
-            <w:tcW w:type="dxa" w:w="1234"/>
-          </w:tcPr>
-          <w:p>
-            <w:r>
-              <w:t>4</w:t>
-            </w:r>
-          </w:p>
-        </w:tc>
-        <w:tc>
-          <w:tcPr>
-            <w:tcW w:type="dxa" w:w="1234"/>
-          </w:tcPr>
-          <w:p>
-            <w:r>
-              <w:t>peer-2</w:t>
-            </w:r>
-          </w:p>
-        </w:tc>
-        <w:tc>
-          <w:tcPr>
-            <w:tcW w:type="dxa" w:w="1234"/>
-          </w:tcPr>
-          <w:p>
-            <w:r>
-              <w:t>33</w:t>
-            </w:r>
-          </w:p>
-        </w:tc>
-        <w:tc>
-          <w:tcPr>
-            <w:tcW w:type="dxa" w:w="1234"/>
-          </w:tcPr>
-          <w:p>
-            <w:r>
-              <w:t>172.55</w:t>
-            </w:r>
-          </w:p>
-        </w:tc>
-        <w:tc>
-          <w:tcPr>
-            <w:tcW w:type="dxa" w:w="1234"/>
-          </w:tcPr>
-          <w:p>
-            <w:r>
-              <w:t>3.00</w:t>
-            </w:r>
-          </w:p>
-        </w:tc>
-        <w:tc>
-          <w:tcPr>
-            <w:tcW w:type="dxa" w:w="1234"/>
-          </w:tcPr>
-          <w:p>
-            <w:r>
-              <w:t>30.09</w:t>
-            </w:r>
-          </w:p>
-        </w:tc>
-      </w:tr>
-      <w:tr>
-        <w:tc>
-          <w:tcPr>
-            <w:tcW w:type="dxa" w:w="1234"/>
-          </w:tcPr>
-          <w:p>
-            <w:r>
-              <w:t>h264 / video-frame-timer</w:t>
-            </w:r>
-          </w:p>
-        </w:tc>
-        <w:tc>
-          <w:tcPr>
-            <w:tcW w:type="dxa" w:w="1234"/>
-          </w:tcPr>
-          <w:p>
-            <w:r>
-              <w:t>4</w:t>
-            </w:r>
-          </w:p>
-        </w:tc>
-        <w:tc>
-          <w:tcPr>
-            <w:tcW w:type="dxa" w:w="1234"/>
-          </w:tcPr>
-          <w:p>
-            <w:r>
-              <w:t>peer-3</w:t>
-            </w:r>
-          </w:p>
-        </w:tc>
-        <w:tc>
-          <w:tcPr>
-            <w:tcW w:type="dxa" w:w="1234"/>
-          </w:tcPr>
-          <w:p>
-            <w:r>
-              <w:t>33</w:t>
-            </w:r>
-          </w:p>
-        </w:tc>
-        <w:tc>
-          <w:tcPr>
-            <w:tcW w:type="dxa" w:w="1234"/>
-          </w:tcPr>
-          <w:p>
-            <w:r>
-              <w:t>172.20</w:t>
-            </w:r>
-          </w:p>
-        </w:tc>
-        <w:tc>
-          <w:tcPr>
-            <w:tcW w:type="dxa" w:w="1234"/>
-          </w:tcPr>
-          <w:p>
-            <w:r>
-              <w:t>3.00</w:t>
-            </w:r>
-          </w:p>
-        </w:tc>
-        <w:tc>
-          <w:tcPr>
-            <w:tcW w:type="dxa" w:w="1234"/>
-          </w:tcPr>
-          <w:p>
-            <w:r>
-              <w:t>29.95</w:t>
-            </w:r>
-          </w:p>
-        </w:tc>
-      </w:tr>
-      <w:tr>
-        <w:tc>
-          <w:tcPr>
-            <w:tcW w:type="dxa" w:w="1234"/>
-          </w:tcPr>
-          <w:p>
-            <w:r>
-              <w:t>simulcast / video-frame-timer</w:t>
-            </w:r>
-          </w:p>
-        </w:tc>
-        <w:tc>
-          <w:tcPr>
-            <w:tcW w:type="dxa" w:w="1234"/>
-          </w:tcPr>
-          <w:p>
-            <w:r>
-              <w:t>2</w:t>
-            </w:r>
-          </w:p>
-        </w:tc>
-        <w:tc>
-          <w:tcPr>
-            <w:tcW w:type="dxa" w:w="1234"/>
-          </w:tcPr>
-          <w:p>
-            <w:r>
-              <w:t>peer-0</w:t>
-            </w:r>
-          </w:p>
-        </w:tc>
-        <w:tc>
-          <w:tcPr>
-            <w:tcW w:type="dxa" w:w="1234"/>
-          </w:tcPr>
-          <w:p>
-            <w:r>
-              <w:t>32</w:t>
-            </w:r>
-          </w:p>
-        </w:tc>
-        <w:tc>
-          <w:tcPr>
-            <w:tcW w:type="dxa" w:w="1234"/>
-          </w:tcPr>
-          <w:p>
-            <w:r>
-              <w:t>251.03</w:t>
-            </w:r>
-          </w:p>
-        </w:tc>
-        <w:tc>
-          <w:tcPr>
-            <w:tcW w:type="dxa" w:w="1234"/>
-          </w:tcPr>
-          <w:p>
-            <w:r>
-              <w:t>1.00</w:t>
-            </w:r>
-          </w:p>
-        </w:tc>
-        <w:tc>
-          <w:tcPr>
-            <w:tcW w:type="dxa" w:w="1234"/>
-          </w:tcPr>
-          <w:p>
-            <w:r>
-              <w:t>28.87</w:t>
-            </w:r>
-          </w:p>
-        </w:tc>
-      </w:tr>
-      <w:tr>
-        <w:tc>
-          <w:tcPr>
-            <w:tcW w:type="dxa" w:w="1234"/>
-          </w:tcPr>
-          <w:p>
-            <w:r>
-              <w:t>simulcast / video-frame-timer</w:t>
-            </w:r>
-          </w:p>
-        </w:tc>
-        <w:tc>
-          <w:tcPr>
-            <w:tcW w:type="dxa" w:w="1234"/>
-          </w:tcPr>
-          <w:p>
-            <w:r>
-              <w:t>2</w:t>
-            </w:r>
-          </w:p>
-        </w:tc>
-        <w:tc>
-          <w:tcPr>
-            <w:tcW w:type="dxa" w:w="1234"/>
-          </w:tcPr>
-          <w:p>
-            <w:r>
-              <w:t>peer-1</w:t>
-            </w:r>
-          </w:p>
-        </w:tc>
-        <w:tc>
-          <w:tcPr>
-            <w:tcW w:type="dxa" w:w="1234"/>
-          </w:tcPr>
-          <w:p>
-            <w:r>
-              <w:t>31</w:t>
-            </w:r>
-          </w:p>
-        </w:tc>
-        <w:tc>
-          <w:tcPr>
-            <w:tcW w:type="dxa" w:w="1234"/>
-          </w:tcPr>
-          <w:p>
-            <w:r>
-              <w:t>276.91</w:t>
-            </w:r>
-          </w:p>
-        </w:tc>
-        <w:tc>
-          <w:tcPr>
-            <w:tcW w:type="dxa" w:w="1234"/>
-          </w:tcPr>
-          <w:p>
-            <w:r>
-              <w:t>2.00</w:t>
-            </w:r>
-          </w:p>
-        </w:tc>
-        <w:tc>
-          <w:tcPr>
-            <w:tcW w:type="dxa" w:w="1234"/>
-          </w:tcPr>
-          <w:p>
-            <w:r>
-              <w:t>29.20</w:t>
-            </w:r>
-          </w:p>
-        </w:tc>
-      </w:tr>
-      <w:tr>
-        <w:tc>
-          <w:tcPr>
-            <w:tcW w:type="dxa" w:w="1234"/>
-          </w:tcPr>
-          <w:p>
-            <w:r>
-              <w:t>vp9 / video-frame-timer</w:t>
-            </w:r>
-          </w:p>
-        </w:tc>
-        <w:tc>
-          <w:tcPr>
-            <w:tcW w:type="dxa" w:w="1234"/>
-          </w:tcPr>
-          <w:p>
-            <w:r>
-              <w:t>2</w:t>
-            </w:r>
-          </w:p>
-        </w:tc>
-        <w:tc>
-          <w:tcPr>
-            <w:tcW w:type="dxa" w:w="1234"/>
-          </w:tcPr>
-          <w:p>
-            <w:r>
-              <w:t>peer-0</w:t>
-            </w:r>
-          </w:p>
-        </w:tc>
-        <w:tc>
-          <w:tcPr>
-            <w:tcW w:type="dxa" w:w="1234"/>
-          </w:tcPr>
-          <w:p>
-            <w:r>
-              <w:t>32</w:t>
-            </w:r>
-          </w:p>
-        </w:tc>
-        <w:tc>
-          <w:tcPr>
-            <w:tcW w:type="dxa" w:w="1234"/>
-          </w:tcPr>
-          <w:p>
-            <w:r>
-              <w:t>413.93</w:t>
-            </w:r>
-          </w:p>
-        </w:tc>
-        <w:tc>
-          <w:tcPr>
-            <w:tcW w:type="dxa" w:w="1234"/>
-          </w:tcPr>
-          <w:p>
-            <w:r>
-              <w:t>2.00</w:t>
-            </w:r>
-          </w:p>
-        </w:tc>
-        <w:tc>
-          <w:tcPr>
-            <w:tcW w:type="dxa" w:w="1234"/>
-          </w:tcPr>
-          <w:p>
-            <w:r>
-              <w:t>30.33</w:t>
-            </w:r>
-          </w:p>
-        </w:tc>
-      </w:tr>
-      <w:tr>
-        <w:tc>
-          <w:tcPr>
-            <w:tcW w:type="dxa" w:w="1234"/>
-          </w:tcPr>
-          <w:p>
-            <w:r>
-              <w:t>vp9 / video-frame-timer</w:t>
-            </w:r>
-          </w:p>
-        </w:tc>
-        <w:tc>
-          <w:tcPr>
-            <w:tcW w:type="dxa" w:w="1234"/>
-          </w:tcPr>
-          <w:p>
-            <w:r>
-              <w:t>2</w:t>
-            </w:r>
-          </w:p>
-        </w:tc>
-        <w:tc>
-          <w:tcPr>
-            <w:tcW w:type="dxa" w:w="1234"/>
-          </w:tcPr>
-          <w:p>
-            <w:r>
-              <w:t>peer-1</w:t>
-            </w:r>
-          </w:p>
-        </w:tc>
-        <w:tc>
-          <w:tcPr>
-            <w:tcW w:type="dxa" w:w="1234"/>
-          </w:tcPr>
-          <w:p>
-            <w:r>
-              <w:t>31</w:t>
-            </w:r>
-          </w:p>
-        </w:tc>
-        <w:tc>
-          <w:tcPr>
-            <w:tcW w:type="dxa" w:w="1234"/>
-          </w:tcPr>
-          <w:p>
-            <w:r>
-              <w:t>411.43</w:t>
-            </w:r>
-          </w:p>
-        </w:tc>
-        <w:tc>
-          <w:tcPr>
-            <w:tcW w:type="dxa" w:w="1234"/>
-          </w:tcPr>
-          <w:p>
-            <w:r>
-              <w:t>1.00</w:t>
-            </w:r>
-          </w:p>
-        </w:tc>
-        <w:tc>
-          <w:tcPr>
-            <w:tcW w:type="dxa" w:w="1234"/>
-          </w:tcPr>
-          <w:p>
-            <w:r>
-              <w:t>29.17</w:t>
+              <w:t>32.33</w:t>
             </w:r>
           </w:p>
         </w:tc>
@@ -1879,7 +588,7 @@
     </w:tbl>
     <w:p>
       <w:r>
-        <w:t>Upload is the sum of outbound RTP payload counters differentiated over time; transport headers and network overhead are excluded. FPS averages available inbound video reports. RTT is ICE candidate-pair RTT and does not measure end-to-end audio delay. Per-peer results from a shared laptop are correlated.</w:t>
+        <w:t>Upload is the average of per-peer means from outbound RTP payload counter differences; headers and network overhead are excluded. FPS averages per-peer inbound video means. SFU CPU is worker utilization as a percentage of one core. CPU/RSS use peer 0 server telemetry so the server is not counted once per endpoint; Node RSS excludes the separate worker process. Full per-peer values and setup timings are in the CSV. Per-peer results from a shared laptop are correlated. ICE RTT is not end-to-end audio delay.</w:t>
       </w:r>
     </w:p>
     <w:p>
@@ -1935,6 +644,927 @@
         <w:pStyle w:val="Heading1"/>
       </w:pPr>
       <w:r>
+        <w:t>Controlled Linux media-network experiments</w:t>
+      </w:r>
+    </w:p>
+    <w:p>
+      <w:r>
+        <w:t>The SFU runs in a dedicated Docker Linux container on the same physical laptop as two synthetic Edge endpoints. Network shaping applies only to outgoing SFU media, shared across receivers; signaling is excluded. It is not a per-sender uplink experiment. Delay is applied in one direction. Configurations, actual rate-change timestamps and kernel queue/drop counters are saved under artifacts/network. One exploratory run per profile, no fixed random seed and no confidence interval. A functional pass is not a conversational-quality acceptance result.</w:t>
+      </w:r>
+    </w:p>
+    <w:tbl>
+      <w:tblPr>
+        <w:tblStyle w:val="LightShading-Accent1"/>
+        <w:tblW w:type="auto" w:w="0"/>
+        <w:tblLook w:firstColumn="1" w:firstRow="1" w:lastColumn="0" w:lastRow="0" w:noHBand="0" w:noVBand="1" w:val="04A0"/>
+      </w:tblPr>
+      <w:tblGrid>
+        <w:gridCol w:w="1728"/>
+        <w:gridCol w:w="1728"/>
+        <w:gridCol w:w="1728"/>
+        <w:gridCol w:w="1728"/>
+        <w:gridCol w:w="1728"/>
+      </w:tblGrid>
+      <w:tr>
+        <w:tc>
+          <w:tcPr>
+            <w:tcW w:type="dxa" w:w="1728"/>
+          </w:tcPr>
+          <w:p>
+            <w:r>
+              <w:t>Profile</w:t>
+            </w:r>
+          </w:p>
+        </w:tc>
+        <w:tc>
+          <w:tcPr>
+            <w:tcW w:type="dxa" w:w="1728"/>
+          </w:tcPr>
+          <w:p>
+            <w:r>
+              <w:t>Exit code</w:t>
+            </w:r>
+          </w:p>
+        </w:tc>
+        <w:tc>
+          <w:tcPr>
+            <w:tcW w:type="dxa" w:w="1728"/>
+          </w:tcPr>
+          <w:p>
+            <w:r>
+              <w:t>RTT p95 max ms</w:t>
+            </w:r>
+          </w:p>
+        </w:tc>
+        <w:tc>
+          <w:tcPr>
+            <w:tcW w:type="dxa" w:w="1728"/>
+          </w:tcPr>
+          <w:p>
+            <w:r>
+              <w:t>Mean video FPS</w:t>
+            </w:r>
+          </w:p>
+        </w:tc>
+        <w:tc>
+          <w:tcPr>
+            <w:tcW w:type="dxa" w:w="1728"/>
+          </w:tcPr>
+          <w:p>
+            <w:r>
+              <w:t>Kernel drops</w:t>
+            </w:r>
+          </w:p>
+        </w:tc>
+      </w:tr>
+      <w:tr>
+        <w:tc>
+          <w:tcPr>
+            <w:tcW w:type="dxa" w:w="1728"/>
+          </w:tcPr>
+          <w:p>
+            <w:r>
+              <w:t>egress-1500kbit</w:t>
+            </w:r>
+          </w:p>
+        </w:tc>
+        <w:tc>
+          <w:tcPr>
+            <w:tcW w:type="dxa" w:w="1728"/>
+          </w:tcPr>
+          <w:p>
+            <w:r>
+              <w:t>0</w:t>
+            </w:r>
+          </w:p>
+        </w:tc>
+        <w:tc>
+          <w:tcPr>
+            <w:tcW w:type="dxa" w:w="1728"/>
+          </w:tcPr>
+          <w:p>
+            <w:r>
+              <w:t>8.95</w:t>
+            </w:r>
+          </w:p>
+        </w:tc>
+        <w:tc>
+          <w:tcPr>
+            <w:tcW w:type="dxa" w:w="1728"/>
+          </w:tcPr>
+          <w:p>
+            <w:r>
+              <w:t>29.63</w:t>
+            </w:r>
+          </w:p>
+        </w:tc>
+        <w:tc>
+          <w:tcPr>
+            <w:tcW w:type="dxa" w:w="1728"/>
+          </w:tcPr>
+          <w:p>
+            <w:r>
+              <w:t>0</w:t>
+            </w:r>
+          </w:p>
+        </w:tc>
+      </w:tr>
+      <w:tr>
+        <w:tc>
+          <w:tcPr>
+            <w:tcW w:type="dxa" w:w="1728"/>
+          </w:tcPr>
+          <w:p>
+            <w:r>
+              <w:t>egress-250kbit</w:t>
+            </w:r>
+          </w:p>
+        </w:tc>
+        <w:tc>
+          <w:tcPr>
+            <w:tcW w:type="dxa" w:w="1728"/>
+          </w:tcPr>
+          <w:p>
+            <w:r>
+              <w:t>0</w:t>
+            </w:r>
+          </w:p>
+        </w:tc>
+        <w:tc>
+          <w:tcPr>
+            <w:tcW w:type="dxa" w:w="1728"/>
+          </w:tcPr>
+          <w:p>
+            <w:r>
+              <w:t>6936.00</w:t>
+            </w:r>
+          </w:p>
+        </w:tc>
+        <w:tc>
+          <w:tcPr>
+            <w:tcW w:type="dxa" w:w="1728"/>
+          </w:tcPr>
+          <w:p>
+            <w:r>
+              <w:t>13.32</w:t>
+            </w:r>
+          </w:p>
+        </w:tc>
+        <w:tc>
+          <w:tcPr>
+            <w:tcW w:type="dxa" w:w="1728"/>
+          </w:tcPr>
+          <w:p>
+            <w:r>
+              <w:t>232</w:t>
+            </w:r>
+          </w:p>
+        </w:tc>
+      </w:tr>
+      <w:tr>
+        <w:tc>
+          <w:tcPr>
+            <w:tcW w:type="dxa" w:w="1728"/>
+          </w:tcPr>
+          <w:p>
+            <w:r>
+              <w:t>egress-500kbit</w:t>
+            </w:r>
+          </w:p>
+        </w:tc>
+        <w:tc>
+          <w:tcPr>
+            <w:tcW w:type="dxa" w:w="1728"/>
+          </w:tcPr>
+          <w:p>
+            <w:r>
+              <w:t>0</w:t>
+            </w:r>
+          </w:p>
+        </w:tc>
+        <w:tc>
+          <w:tcPr>
+            <w:tcW w:type="dxa" w:w="1728"/>
+          </w:tcPr>
+          <w:p>
+            <w:r>
+              <w:t>695.55</w:t>
+            </w:r>
+          </w:p>
+        </w:tc>
+        <w:tc>
+          <w:tcPr>
+            <w:tcW w:type="dxa" w:w="1728"/>
+          </w:tcPr>
+          <w:p>
+            <w:r>
+              <w:t>29.55</w:t>
+            </w:r>
+          </w:p>
+        </w:tc>
+        <w:tc>
+          <w:tcPr>
+            <w:tcW w:type="dxa" w:w="1728"/>
+          </w:tcPr>
+          <w:p>
+            <w:r>
+              <w:t>0</w:t>
+            </w:r>
+          </w:p>
+        </w:tc>
+      </w:tr>
+      <w:tr>
+        <w:tc>
+          <w:tcPr>
+            <w:tcW w:type="dxa" w:w="1728"/>
+          </w:tcPr>
+          <w:p>
+            <w:r>
+              <w:t>egress-750kbit</w:t>
+            </w:r>
+          </w:p>
+        </w:tc>
+        <w:tc>
+          <w:tcPr>
+            <w:tcW w:type="dxa" w:w="1728"/>
+          </w:tcPr>
+          <w:p>
+            <w:r>
+              <w:t>0</w:t>
+            </w:r>
+          </w:p>
+        </w:tc>
+        <w:tc>
+          <w:tcPr>
+            <w:tcW w:type="dxa" w:w="1728"/>
+          </w:tcPr>
+          <w:p>
+            <w:r>
+              <w:t>19.00</w:t>
+            </w:r>
+          </w:p>
+        </w:tc>
+        <w:tc>
+          <w:tcPr>
+            <w:tcW w:type="dxa" w:w="1728"/>
+          </w:tcPr>
+          <w:p>
+            <w:r>
+              <w:t>30.37</w:t>
+            </w:r>
+          </w:p>
+        </w:tc>
+        <w:tc>
+          <w:tcPr>
+            <w:tcW w:type="dxa" w:w="1728"/>
+          </w:tcPr>
+          <w:p>
+            <w:r>
+              <w:t>0</w:t>
+            </w:r>
+          </w:p>
+        </w:tc>
+      </w:tr>
+      <w:tr>
+        <w:tc>
+          <w:tcPr>
+            <w:tcW w:type="dxa" w:w="1728"/>
+          </w:tcPr>
+          <w:p>
+            <w:r>
+              <w:t>egress-delay-100ms</w:t>
+            </w:r>
+          </w:p>
+        </w:tc>
+        <w:tc>
+          <w:tcPr>
+            <w:tcW w:type="dxa" w:w="1728"/>
+          </w:tcPr>
+          <w:p>
+            <w:r>
+              <w:t>0</w:t>
+            </w:r>
+          </w:p>
+        </w:tc>
+        <w:tc>
+          <w:tcPr>
+            <w:tcW w:type="dxa" w:w="1728"/>
+          </w:tcPr>
+          <w:p>
+            <w:r>
+              <w:t>105.00</w:t>
+            </w:r>
+          </w:p>
+        </w:tc>
+        <w:tc>
+          <w:tcPr>
+            <w:tcW w:type="dxa" w:w="1728"/>
+          </w:tcPr>
+          <w:p>
+            <w:r>
+              <w:t>30.06</w:t>
+            </w:r>
+          </w:p>
+        </w:tc>
+        <w:tc>
+          <w:tcPr>
+            <w:tcW w:type="dxa" w:w="1728"/>
+          </w:tcPr>
+          <w:p>
+            <w:r>
+              <w:t>0</w:t>
+            </w:r>
+          </w:p>
+        </w:tc>
+      </w:tr>
+      <w:tr>
+        <w:tc>
+          <w:tcPr>
+            <w:tcW w:type="dxa" w:w="1728"/>
+          </w:tcPr>
+          <w:p>
+            <w:r>
+              <w:t>egress-delay-200ms</w:t>
+            </w:r>
+          </w:p>
+        </w:tc>
+        <w:tc>
+          <w:tcPr>
+            <w:tcW w:type="dxa" w:w="1728"/>
+          </w:tcPr>
+          <w:p>
+            <w:r>
+              <w:t>0</w:t>
+            </w:r>
+          </w:p>
+        </w:tc>
+        <w:tc>
+          <w:tcPr>
+            <w:tcW w:type="dxa" w:w="1728"/>
+          </w:tcPr>
+          <w:p>
+            <w:r>
+              <w:t>216.00</w:t>
+            </w:r>
+          </w:p>
+        </w:tc>
+        <w:tc>
+          <w:tcPr>
+            <w:tcW w:type="dxa" w:w="1728"/>
+          </w:tcPr>
+          <w:p>
+            <w:r>
+              <w:t>30.36</w:t>
+            </w:r>
+          </w:p>
+        </w:tc>
+        <w:tc>
+          <w:tcPr>
+            <w:tcW w:type="dxa" w:w="1728"/>
+          </w:tcPr>
+          <w:p>
+            <w:r>
+              <w:t>0</w:t>
+            </w:r>
+          </w:p>
+        </w:tc>
+      </w:tr>
+      <w:tr>
+        <w:tc>
+          <w:tcPr>
+            <w:tcW w:type="dxa" w:w="1728"/>
+          </w:tcPr>
+          <w:p>
+            <w:r>
+              <w:t>egress-delay-400ms</w:t>
+            </w:r>
+          </w:p>
+        </w:tc>
+        <w:tc>
+          <w:tcPr>
+            <w:tcW w:type="dxa" w:w="1728"/>
+          </w:tcPr>
+          <w:p>
+            <w:r>
+              <w:t>0</w:t>
+            </w:r>
+          </w:p>
+        </w:tc>
+        <w:tc>
+          <w:tcPr>
+            <w:tcW w:type="dxa" w:w="1728"/>
+          </w:tcPr>
+          <w:p>
+            <w:r>
+              <w:t>405.00</w:t>
+            </w:r>
+          </w:p>
+        </w:tc>
+        <w:tc>
+          <w:tcPr>
+            <w:tcW w:type="dxa" w:w="1728"/>
+          </w:tcPr>
+          <w:p>
+            <w:r>
+              <w:t>30.22</w:t>
+            </w:r>
+          </w:p>
+        </w:tc>
+        <w:tc>
+          <w:tcPr>
+            <w:tcW w:type="dxa" w:w="1728"/>
+          </w:tcPr>
+          <w:p>
+            <w:r>
+              <w:t>0</w:t>
+            </w:r>
+          </w:p>
+        </w:tc>
+      </w:tr>
+      <w:tr>
+        <w:tc>
+          <w:tcPr>
+            <w:tcW w:type="dxa" w:w="1728"/>
+          </w:tcPr>
+          <w:p>
+            <w:r>
+              <w:t>egress-jitter-10ms</w:t>
+            </w:r>
+          </w:p>
+        </w:tc>
+        <w:tc>
+          <w:tcPr>
+            <w:tcW w:type="dxa" w:w="1728"/>
+          </w:tcPr>
+          <w:p>
+            <w:r>
+              <w:t>0</w:t>
+            </w:r>
+          </w:p>
+        </w:tc>
+        <w:tc>
+          <w:tcPr>
+            <w:tcW w:type="dxa" w:w="1728"/>
+          </w:tcPr>
+          <w:p>
+            <w:r>
+              <w:t>122.00</w:t>
+            </w:r>
+          </w:p>
+        </w:tc>
+        <w:tc>
+          <w:tcPr>
+            <w:tcW w:type="dxa" w:w="1728"/>
+          </w:tcPr>
+          <w:p>
+            <w:r>
+              <w:t>30.29</w:t>
+            </w:r>
+          </w:p>
+        </w:tc>
+        <w:tc>
+          <w:tcPr>
+            <w:tcW w:type="dxa" w:w="1728"/>
+          </w:tcPr>
+          <w:p>
+            <w:r>
+              <w:t>0</w:t>
+            </w:r>
+          </w:p>
+        </w:tc>
+      </w:tr>
+      <w:tr>
+        <w:tc>
+          <w:tcPr>
+            <w:tcW w:type="dxa" w:w="1728"/>
+          </w:tcPr>
+          <w:p>
+            <w:r>
+              <w:t>egress-jitter-30ms</w:t>
+            </w:r>
+          </w:p>
+        </w:tc>
+        <w:tc>
+          <w:tcPr>
+            <w:tcW w:type="dxa" w:w="1728"/>
+          </w:tcPr>
+          <w:p>
+            <w:r>
+              <w:t>0</w:t>
+            </w:r>
+          </w:p>
+        </w:tc>
+        <w:tc>
+          <w:tcPr>
+            <w:tcW w:type="dxa" w:w="1728"/>
+          </w:tcPr>
+          <w:p>
+            <w:r>
+              <w:t>171.00</w:t>
+            </w:r>
+          </w:p>
+        </w:tc>
+        <w:tc>
+          <w:tcPr>
+            <w:tcW w:type="dxa" w:w="1728"/>
+          </w:tcPr>
+          <w:p>
+            <w:r>
+              <w:t>30.43</w:t>
+            </w:r>
+          </w:p>
+        </w:tc>
+        <w:tc>
+          <w:tcPr>
+            <w:tcW w:type="dxa" w:w="1728"/>
+          </w:tcPr>
+          <w:p>
+            <w:r>
+              <w:t>0</w:t>
+            </w:r>
+          </w:p>
+        </w:tc>
+      </w:tr>
+      <w:tr>
+        <w:tc>
+          <w:tcPr>
+            <w:tcW w:type="dxa" w:w="1728"/>
+          </w:tcPr>
+          <w:p>
+            <w:r>
+              <w:t>egress-jitter-60ms</w:t>
+            </w:r>
+          </w:p>
+        </w:tc>
+        <w:tc>
+          <w:tcPr>
+            <w:tcW w:type="dxa" w:w="1728"/>
+          </w:tcPr>
+          <w:p>
+            <w:r>
+              <w:t>0</w:t>
+            </w:r>
+          </w:p>
+        </w:tc>
+        <w:tc>
+          <w:tcPr>
+            <w:tcW w:type="dxa" w:w="1728"/>
+          </w:tcPr>
+          <w:p>
+            <w:r>
+              <w:t>218.70</w:t>
+            </w:r>
+          </w:p>
+        </w:tc>
+        <w:tc>
+          <w:tcPr>
+            <w:tcW w:type="dxa" w:w="1728"/>
+          </w:tcPr>
+          <w:p>
+            <w:r>
+              <w:t>30.25</w:t>
+            </w:r>
+          </w:p>
+        </w:tc>
+        <w:tc>
+          <w:tcPr>
+            <w:tcW w:type="dxa" w:w="1728"/>
+          </w:tcPr>
+          <w:p>
+            <w:r>
+              <w:t>0</w:t>
+            </w:r>
+          </w:p>
+        </w:tc>
+      </w:tr>
+      <w:tr>
+        <w:tc>
+          <w:tcPr>
+            <w:tcW w:type="dxa" w:w="1728"/>
+          </w:tcPr>
+          <w:p>
+            <w:r>
+              <w:t>egress-loss-10pct</w:t>
+            </w:r>
+          </w:p>
+        </w:tc>
+        <w:tc>
+          <w:tcPr>
+            <w:tcW w:type="dxa" w:w="1728"/>
+          </w:tcPr>
+          <w:p>
+            <w:r>
+              <w:t>0</w:t>
+            </w:r>
+          </w:p>
+        </w:tc>
+        <w:tc>
+          <w:tcPr>
+            <w:tcW w:type="dxa" w:w="1728"/>
+          </w:tcPr>
+          <w:p>
+            <w:r>
+              <w:t>5.00</w:t>
+            </w:r>
+          </w:p>
+        </w:tc>
+        <w:tc>
+          <w:tcPr>
+            <w:tcW w:type="dxa" w:w="1728"/>
+          </w:tcPr>
+          <w:p>
+            <w:r>
+              <w:t>29.70</w:t>
+            </w:r>
+          </w:p>
+        </w:tc>
+        <w:tc>
+          <w:tcPr>
+            <w:tcW w:type="dxa" w:w="1728"/>
+          </w:tcPr>
+          <w:p>
+            <w:r>
+              <w:t>631</w:t>
+            </w:r>
+          </w:p>
+        </w:tc>
+      </w:tr>
+      <w:tr>
+        <w:tc>
+          <w:tcPr>
+            <w:tcW w:type="dxa" w:w="1728"/>
+          </w:tcPr>
+          <w:p>
+            <w:r>
+              <w:t>egress-loss-1pct</w:t>
+            </w:r>
+          </w:p>
+        </w:tc>
+        <w:tc>
+          <w:tcPr>
+            <w:tcW w:type="dxa" w:w="1728"/>
+          </w:tcPr>
+          <w:p>
+            <w:r>
+              <w:t>0</w:t>
+            </w:r>
+          </w:p>
+        </w:tc>
+        <w:tc>
+          <w:tcPr>
+            <w:tcW w:type="dxa" w:w="1728"/>
+          </w:tcPr>
+          <w:p>
+            <w:r>
+              <w:t>6.00</w:t>
+            </w:r>
+          </w:p>
+        </w:tc>
+        <w:tc>
+          <w:tcPr>
+            <w:tcW w:type="dxa" w:w="1728"/>
+          </w:tcPr>
+          <w:p>
+            <w:r>
+              <w:t>29.82</w:t>
+            </w:r>
+          </w:p>
+        </w:tc>
+        <w:tc>
+          <w:tcPr>
+            <w:tcW w:type="dxa" w:w="1728"/>
+          </w:tcPr>
+          <w:p>
+            <w:r>
+              <w:t>56</w:t>
+            </w:r>
+          </w:p>
+        </w:tc>
+      </w:tr>
+      <w:tr>
+        <w:tc>
+          <w:tcPr>
+            <w:tcW w:type="dxa" w:w="1728"/>
+          </w:tcPr>
+          <w:p>
+            <w:r>
+              <w:t>egress-loss-3pct</w:t>
+            </w:r>
+          </w:p>
+        </w:tc>
+        <w:tc>
+          <w:tcPr>
+            <w:tcW w:type="dxa" w:w="1728"/>
+          </w:tcPr>
+          <w:p>
+            <w:r>
+              <w:t>0</w:t>
+            </w:r>
+          </w:p>
+        </w:tc>
+        <w:tc>
+          <w:tcPr>
+            <w:tcW w:type="dxa" w:w="1728"/>
+          </w:tcPr>
+          <w:p>
+            <w:r>
+              <w:t>5.00</w:t>
+            </w:r>
+          </w:p>
+        </w:tc>
+        <w:tc>
+          <w:tcPr>
+            <w:tcW w:type="dxa" w:w="1728"/>
+          </w:tcPr>
+          <w:p>
+            <w:r>
+              <w:t>29.79</w:t>
+            </w:r>
+          </w:p>
+        </w:tc>
+        <w:tc>
+          <w:tcPr>
+            <w:tcW w:type="dxa" w:w="1728"/>
+          </w:tcPr>
+          <w:p>
+            <w:r>
+              <w:t>178</w:t>
+            </w:r>
+          </w:p>
+        </w:tc>
+      </w:tr>
+      <w:tr>
+        <w:tc>
+          <w:tcPr>
+            <w:tcW w:type="dxa" w:w="1728"/>
+          </w:tcPr>
+          <w:p>
+            <w:r>
+              <w:t>egress-loss-5pct</w:t>
+            </w:r>
+          </w:p>
+        </w:tc>
+        <w:tc>
+          <w:tcPr>
+            <w:tcW w:type="dxa" w:w="1728"/>
+          </w:tcPr>
+          <w:p>
+            <w:r>
+              <w:t>0</w:t>
+            </w:r>
+          </w:p>
+        </w:tc>
+        <w:tc>
+          <w:tcPr>
+            <w:tcW w:type="dxa" w:w="1728"/>
+          </w:tcPr>
+          <w:p>
+            <w:r>
+              <w:t>7.40</w:t>
+            </w:r>
+          </w:p>
+        </w:tc>
+        <w:tc>
+          <w:tcPr>
+            <w:tcW w:type="dxa" w:w="1728"/>
+          </w:tcPr>
+          <w:p>
+            <w:r>
+              <w:t>29.62</w:t>
+            </w:r>
+          </w:p>
+        </w:tc>
+        <w:tc>
+          <w:tcPr>
+            <w:tcW w:type="dxa" w:w="1728"/>
+          </w:tcPr>
+          <w:p>
+            <w:r>
+              <w:t>318</w:t>
+            </w:r>
+          </w:p>
+        </w:tc>
+      </w:tr>
+      <w:tr>
+        <w:tc>
+          <w:tcPr>
+            <w:tcW w:type="dxa" w:w="1728"/>
+          </w:tcPr>
+          <w:p>
+            <w:r>
+              <w:t>egress-step-2000-500-2000kbit</w:t>
+            </w:r>
+          </w:p>
+        </w:tc>
+        <w:tc>
+          <w:tcPr>
+            <w:tcW w:type="dxa" w:w="1728"/>
+          </w:tcPr>
+          <w:p>
+            <w:r>
+              <w:t>0</w:t>
+            </w:r>
+          </w:p>
+        </w:tc>
+        <w:tc>
+          <w:tcPr>
+            <w:tcW w:type="dxa" w:w="1728"/>
+          </w:tcPr>
+          <w:p>
+            <w:r>
+              <w:t>1354.40</w:t>
+            </w:r>
+          </w:p>
+        </w:tc>
+        <w:tc>
+          <w:tcPr>
+            <w:tcW w:type="dxa" w:w="1728"/>
+          </w:tcPr>
+          <w:p>
+            <w:r>
+              <w:t>30.14</w:t>
+            </w:r>
+          </w:p>
+        </w:tc>
+        <w:tc>
+          <w:tcPr>
+            <w:tcW w:type="dxa" w:w="1728"/>
+          </w:tcPr>
+          <w:p>
+            <w:r>
+              <w:t>0</w:t>
+            </w:r>
+          </w:p>
+        </w:tc>
+      </w:tr>
+      <w:tr>
+        <w:tc>
+          <w:tcPr>
+            <w:tcW w:type="dxa" w:w="1728"/>
+          </w:tcPr>
+          <w:p>
+            <w:r>
+              <w:t>linux-clean</w:t>
+            </w:r>
+          </w:p>
+        </w:tc>
+        <w:tc>
+          <w:tcPr>
+            <w:tcW w:type="dxa" w:w="1728"/>
+          </w:tcPr>
+          <w:p>
+            <w:r>
+              <w:t>0</w:t>
+            </w:r>
+          </w:p>
+        </w:tc>
+        <w:tc>
+          <w:tcPr>
+            <w:tcW w:type="dxa" w:w="1728"/>
+          </w:tcPr>
+          <w:p>
+            <w:r>
+              <w:t>7.00</w:t>
+            </w:r>
+          </w:p>
+        </w:tc>
+        <w:tc>
+          <w:tcPr>
+            <w:tcW w:type="dxa" w:w="1728"/>
+          </w:tcPr>
+          <w:p>
+            <w:r>
+              <w:t>29.58</w:t>
+            </w:r>
+          </w:p>
+        </w:tc>
+        <w:tc>
+          <w:tcPr>
+            <w:tcW w:type="dxa" w:w="1728"/>
+          </w:tcPr>
+          <w:p>
+            <w:r>
+              <w:t>N/A</w:t>
+            </w:r>
+          </w:p>
+        </w:tc>
+      </w:tr>
+    </w:tbl>
+    <w:p>
+      <w:r>
+        <w:t>RTT values are the maximum of per-peer p95 values, not pooled p95. Kernel drops include emulation/queue drops and do not equal unrepaired RTP loss. Concealment, NACK and freeze counters are retained in the CSV; no subjective quality score or proof of repair before playback deadlines is inferred.</w:t>
+      </w:r>
+    </w:p>
+    <w:p>
+      <w:r>
+        <w:t>At the shared 250 kb/s cap, mean received video was 13.32 FPS and the maximum peer ICE RTT p95 was 6936.00 ms. The media-progress check passed while queue delay and media diagnostics deteriorated. This is not evidence of acceptable conversational quality or a measured mouth-to-ear result.</w:t>
+      </w:r>
+    </w:p>
+    <w:p>
+      <w:pPr>
+        <w:pStyle w:val="Heading1"/>
+      </w:pPr>
+      <w:r>
         <w:t>Measured figures and screenshots</w:t>
       </w:r>
     </w:p>
@@ -1976,6 +1606,78 @@
     </w:p>
     <w:p>
       <w:r>
+        <w:drawing>
+          <wp:inline xmlns:a="http://schemas.openxmlformats.org/drawingml/2006/main" xmlns:pic="http://schemas.openxmlformats.org/drawingml/2006/picture">
+            <wp:extent cx="5486400" cy="3491345"/>
+            <wp:docPr id="2" name="Picture 2"/>
+            <wp:cNvGraphicFramePr>
+              <a:graphicFrameLocks noChangeAspect="1"/>
+            </wp:cNvGraphicFramePr>
+            <a:graphic>
+              <a:graphicData uri="http://schemas.openxmlformats.org/drawingml/2006/picture">
+                <pic:pic>
+                  <pic:nvPicPr>
+                    <pic:cNvPr id="0" name="network-measurements.png"/>
+                    <pic:cNvPicPr/>
+                  </pic:nvPicPr>
+                  <pic:blipFill>
+                    <a:blip r:embed="rId10"/>
+                    <a:stretch>
+                      <a:fillRect/>
+                    </a:stretch>
+                  </pic:blipFill>
+                  <pic:spPr>
+                    <a:xfrm>
+                      <a:off x="0" y="0"/>
+                      <a:ext cx="5486400" cy="3491345"/>
+                    </a:xfrm>
+                    <a:prstGeom prst="rect"/>
+                  </pic:spPr>
+                </pic:pic>
+              </a:graphicData>
+            </a:graphic>
+          </wp:inline>
+        </w:drawing>
+      </w:r>
+    </w:p>
+    <w:p>
+      <w:r>
+        <w:drawing>
+          <wp:inline xmlns:a="http://schemas.openxmlformats.org/drawingml/2006/main" xmlns:pic="http://schemas.openxmlformats.org/drawingml/2006/picture">
+            <wp:extent cx="5486400" cy="2194560"/>
+            <wp:docPr id="3" name="Picture 3"/>
+            <wp:cNvGraphicFramePr>
+              <a:graphicFrameLocks noChangeAspect="1"/>
+            </wp:cNvGraphicFramePr>
+            <a:graphic>
+              <a:graphicData uri="http://schemas.openxmlformats.org/drawingml/2006/picture">
+                <pic:pic>
+                  <pic:nvPicPr>
+                    <pic:cNvPr id="0" name="step-response.png"/>
+                    <pic:cNvPicPr/>
+                  </pic:nvPicPr>
+                  <pic:blipFill>
+                    <a:blip r:embed="rId11"/>
+                    <a:stretch>
+                      <a:fillRect/>
+                    </a:stretch>
+                  </pic:blipFill>
+                  <pic:spPr>
+                    <a:xfrm>
+                      <a:off x="0" y="0"/>
+                      <a:ext cx="5486400" cy="2194560"/>
+                    </a:xfrm>
+                    <a:prstGeom prst="rect"/>
+                  </pic:spPr>
+                </pic:pic>
+              </a:graphicData>
+            </a:graphic>
+          </wp:inline>
+        </w:drawing>
+      </w:r>
+    </w:p>
+    <w:p>
+      <w:r>
         <w:t>2026-10-23T20-50-58-014Z-h264-6p-windows-software-video</w:t>
       </w:r>
     </w:p>
@@ -1984,7 +1686,7 @@
         <w:drawing>
           <wp:inline xmlns:a="http://schemas.openxmlformats.org/drawingml/2006/main" xmlns:pic="http://schemas.openxmlformats.org/drawingml/2006/picture">
             <wp:extent cx="5486400" cy="5160645"/>
-            <wp:docPr id="2" name="Picture 2"/>
+            <wp:docPr id="4" name="Picture 4"/>
             <wp:cNvGraphicFramePr>
               <a:graphicFrameLocks noChangeAspect="1"/>
             </wp:cNvGraphicFramePr>
@@ -1996,7 +1698,7 @@
                     <pic:cNvPicPr/>
                   </pic:nvPicPr>
                   <pic:blipFill>
-                    <a:blip r:embed="rId10"/>
+                    <a:blip r:embed="rId12"/>
                     <a:stretch>
                       <a:fillRect/>
                     </a:stretch>
@@ -2025,7 +1727,7 @@
         <w:drawing>
           <wp:inline xmlns:a="http://schemas.openxmlformats.org/drawingml/2006/main" xmlns:pic="http://schemas.openxmlformats.org/drawingml/2006/picture">
             <wp:extent cx="5486400" cy="5160645"/>
-            <wp:docPr id="3" name="Picture 3"/>
+            <wp:docPr id="5" name="Picture 5"/>
             <wp:cNvGraphicFramePr>
               <a:graphicFrameLocks noChangeAspect="1"/>
             </wp:cNvGraphicFramePr>
@@ -2037,7 +1739,7 @@
                     <pic:cNvPicPr/>
                   </pic:nvPicPr>
                   <pic:blipFill>
-                    <a:blip r:embed="rId11"/>
+                    <a:blip r:embed="rId13"/>
                     <a:stretch>
                       <a:fillRect/>
                     </a:stretch>
@@ -2066,7 +1768,7 @@
         <w:drawing>
           <wp:inline xmlns:a="http://schemas.openxmlformats.org/drawingml/2006/main" xmlns:pic="http://schemas.openxmlformats.org/drawingml/2006/picture">
             <wp:extent cx="5486400" cy="5134928"/>
-            <wp:docPr id="4" name="Picture 4"/>
+            <wp:docPr id="6" name="Picture 6"/>
             <wp:cNvGraphicFramePr>
               <a:graphicFrameLocks noChangeAspect="1"/>
             </wp:cNvGraphicFramePr>
@@ -2078,7 +1780,7 @@
                     <pic:cNvPicPr/>
                   </pic:nvPicPr>
                   <pic:blipFill>
-                    <a:blip r:embed="rId12"/>
+                    <a:blip r:embed="rId14"/>
                     <a:stretch>
                       <a:fillRect/>
                     </a:stretch>
@@ -2107,7 +1809,7 @@
         <w:drawing>
           <wp:inline xmlns:a="http://schemas.openxmlformats.org/drawingml/2006/main" xmlns:pic="http://schemas.openxmlformats.org/drawingml/2006/picture">
             <wp:extent cx="5486400" cy="4406265"/>
-            <wp:docPr id="5" name="Picture 5"/>
+            <wp:docPr id="7" name="Picture 7"/>
             <wp:cNvGraphicFramePr>
               <a:graphicFrameLocks noChangeAspect="1"/>
             </wp:cNvGraphicFramePr>
@@ -2119,7 +1821,7 @@
                     <pic:cNvPicPr/>
                   </pic:nvPicPr>
                   <pic:blipFill>
-                    <a:blip r:embed="rId13"/>
+                    <a:blip r:embed="rId15"/>
                     <a:stretch>
                       <a:fillRect/>
                     </a:stretch>
@@ -2148,7 +1850,7 @@
         <w:drawing>
           <wp:inline xmlns:a="http://schemas.openxmlformats.org/drawingml/2006/main" xmlns:pic="http://schemas.openxmlformats.org/drawingml/2006/picture">
             <wp:extent cx="5486400" cy="5134928"/>
-            <wp:docPr id="6" name="Picture 6"/>
+            <wp:docPr id="8" name="Picture 8"/>
             <wp:cNvGraphicFramePr>
               <a:graphicFrameLocks noChangeAspect="1"/>
             </wp:cNvGraphicFramePr>
@@ -2160,7 +1862,7 @@
                     <pic:cNvPicPr/>
                   </pic:nvPicPr>
                   <pic:blipFill>
-                    <a:blip r:embed="rId14"/>
+                    <a:blip r:embed="rId16"/>
                     <a:stretch>
                       <a:fillRect/>
                     </a:stretch>
@@ -2189,7 +1891,7 @@
         <w:drawing>
           <wp:inline xmlns:a="http://schemas.openxmlformats.org/drawingml/2006/main" xmlns:pic="http://schemas.openxmlformats.org/drawingml/2006/picture">
             <wp:extent cx="5486400" cy="5134928"/>
-            <wp:docPr id="7" name="Picture 7"/>
+            <wp:docPr id="9" name="Picture 9"/>
             <wp:cNvGraphicFramePr>
               <a:graphicFrameLocks noChangeAspect="1"/>
             </wp:cNvGraphicFramePr>
@@ -2201,7 +1903,171 @@
                     <pic:cNvPicPr/>
                   </pic:nvPicPr>
                   <pic:blipFill>
-                    <a:blip r:embed="rId15"/>
+                    <a:blip r:embed="rId17"/>
+                    <a:stretch>
+                      <a:fillRect/>
+                    </a:stretch>
+                  </pic:blipFill>
+                  <pic:spPr>
+                    <a:xfrm>
+                      <a:off x="0" y="0"/>
+                      <a:ext cx="5486400" cy="5134928"/>
+                    </a:xfrm>
+                    <a:prstGeom prst="rect"/>
+                  </pic:spPr>
+                </pic:pic>
+              </a:graphicData>
+            </a:graphic>
+          </wp:inline>
+        </w:drawing>
+      </w:r>
+    </w:p>
+    <w:p>
+      <w:r>
+        <w:t>2026-10-23T21-04-26-535Z-h264-2p-egress-250kbit</w:t>
+      </w:r>
+    </w:p>
+    <w:p>
+      <w:r>
+        <w:drawing>
+          <wp:inline xmlns:a="http://schemas.openxmlformats.org/drawingml/2006/main" xmlns:pic="http://schemas.openxmlformats.org/drawingml/2006/picture">
+            <wp:extent cx="5486400" cy="5134928"/>
+            <wp:docPr id="10" name="Picture 10"/>
+            <wp:cNvGraphicFramePr>
+              <a:graphicFrameLocks noChangeAspect="1"/>
+            </wp:cNvGraphicFramePr>
+            <a:graphic>
+              <a:graphicData uri="http://schemas.openxmlformats.org/drawingml/2006/picture">
+                <pic:pic>
+                  <pic:nvPicPr>
+                    <pic:cNvPr id="0" name="2026-10-23T21-04-26-535Z-h264-2p-egress-250kbit.png"/>
+                    <pic:cNvPicPr/>
+                  </pic:nvPicPr>
+                  <pic:blipFill>
+                    <a:blip r:embed="rId18"/>
+                    <a:stretch>
+                      <a:fillRect/>
+                    </a:stretch>
+                  </pic:blipFill>
+                  <pic:spPr>
+                    <a:xfrm>
+                      <a:off x="0" y="0"/>
+                      <a:ext cx="5486400" cy="5134928"/>
+                    </a:xfrm>
+                    <a:prstGeom prst="rect"/>
+                  </pic:spPr>
+                </pic:pic>
+              </a:graphicData>
+            </a:graphic>
+          </wp:inline>
+        </w:drawing>
+      </w:r>
+    </w:p>
+    <w:p>
+      <w:r>
+        <w:t>2026-10-23T21-08-46-645Z-h264-2p-egress-loss-10pct</w:t>
+      </w:r>
+    </w:p>
+    <w:p>
+      <w:r>
+        <w:drawing>
+          <wp:inline xmlns:a="http://schemas.openxmlformats.org/drawingml/2006/main" xmlns:pic="http://schemas.openxmlformats.org/drawingml/2006/picture">
+            <wp:extent cx="5486400" cy="5134928"/>
+            <wp:docPr id="11" name="Picture 11"/>
+            <wp:cNvGraphicFramePr>
+              <a:graphicFrameLocks noChangeAspect="1"/>
+            </wp:cNvGraphicFramePr>
+            <a:graphic>
+              <a:graphicData uri="http://schemas.openxmlformats.org/drawingml/2006/picture">
+                <pic:pic>
+                  <pic:nvPicPr>
+                    <pic:cNvPr id="0" name="2026-10-23T21-08-46-645Z-h264-2p-egress-loss-10pct.png"/>
+                    <pic:cNvPicPr/>
+                  </pic:nvPicPr>
+                  <pic:blipFill>
+                    <a:blip r:embed="rId19"/>
+                    <a:stretch>
+                      <a:fillRect/>
+                    </a:stretch>
+                  </pic:blipFill>
+                  <pic:spPr>
+                    <a:xfrm>
+                      <a:off x="0" y="0"/>
+                      <a:ext cx="5486400" cy="5134928"/>
+                    </a:xfrm>
+                    <a:prstGeom prst="rect"/>
+                  </pic:spPr>
+                </pic:pic>
+              </a:graphicData>
+            </a:graphic>
+          </wp:inline>
+        </w:drawing>
+      </w:r>
+    </w:p>
+    <w:p>
+      <w:r>
+        <w:t>2026-10-23T21-12-29-370Z-h264-2p-egress-delay-400ms</w:t>
+      </w:r>
+    </w:p>
+    <w:p>
+      <w:r>
+        <w:drawing>
+          <wp:inline xmlns:a="http://schemas.openxmlformats.org/drawingml/2006/main" xmlns:pic="http://schemas.openxmlformats.org/drawingml/2006/picture">
+            <wp:extent cx="5486400" cy="5134928"/>
+            <wp:docPr id="12" name="Picture 12"/>
+            <wp:cNvGraphicFramePr>
+              <a:graphicFrameLocks noChangeAspect="1"/>
+            </wp:cNvGraphicFramePr>
+            <a:graphic>
+              <a:graphicData uri="http://schemas.openxmlformats.org/drawingml/2006/picture">
+                <pic:pic>
+                  <pic:nvPicPr>
+                    <pic:cNvPr id="0" name="2026-10-23T21-12-29-370Z-h264-2p-egress-delay-400ms.png"/>
+                    <pic:cNvPicPr/>
+                  </pic:nvPicPr>
+                  <pic:blipFill>
+                    <a:blip r:embed="rId20"/>
+                    <a:stretch>
+                      <a:fillRect/>
+                    </a:stretch>
+                  </pic:blipFill>
+                  <pic:spPr>
+                    <a:xfrm>
+                      <a:off x="0" y="0"/>
+                      <a:ext cx="5486400" cy="5134928"/>
+                    </a:xfrm>
+                    <a:prstGeom prst="rect"/>
+                  </pic:spPr>
+                </pic:pic>
+              </a:graphicData>
+            </a:graphic>
+          </wp:inline>
+        </w:drawing>
+      </w:r>
+    </w:p>
+    <w:p>
+      <w:r>
+        <w:t>2026-10-23T21-13-06-388Z-h264-2p-egress-step-2000-500-2000kbit</w:t>
+      </w:r>
+    </w:p>
+    <w:p>
+      <w:r>
+        <w:drawing>
+          <wp:inline xmlns:a="http://schemas.openxmlformats.org/drawingml/2006/main" xmlns:pic="http://schemas.openxmlformats.org/drawingml/2006/picture">
+            <wp:extent cx="5486400" cy="5134928"/>
+            <wp:docPr id="13" name="Picture 13"/>
+            <wp:cNvGraphicFramePr>
+              <a:graphicFrameLocks noChangeAspect="1"/>
+            </wp:cNvGraphicFramePr>
+            <a:graphic>
+              <a:graphicData uri="http://schemas.openxmlformats.org/drawingml/2006/picture">
+                <pic:pic>
+                  <pic:nvPicPr>
+                    <pic:cNvPr id="0" name="2026-10-23T21-13-06-388Z-h264-2p-egress-step-2000-500-2000kbit.png"/>
+                    <pic:cNvPicPr/>
+                  </pic:nvPicPr>
+                  <pic:blipFill>
+                    <a:blip r:embed="rId21"/>
                     <a:stretch>
                       <a:fillRect/>
                     </a:stretch>
@@ -2241,7 +2107,7 @@
         <w:pStyle w:val="ListBullet"/>
       </w:pPr>
       <w:r>
-        <w:t>No bandwidth caps, packet loss, jitter, WAN delay, NAT or TURN path has been exercised in these local trials.</w:t>
+        <w:t>Shared-SFU egress impairment trials are preliminary; per-sender uplink, real WAN, NAT and TURN behavior remain unverified.</w:t>
       </w:r>
     </w:p>
     <w:p>
@@ -2290,7 +2156,7 @@
       </w:r>
     </w:p>
     <w:sectPr>
-      <w:headerReference w:type="default" r:id="rId16"/>
+      <w:headerReference w:type="default" r:id="rId22"/>
       <w:pgSz w:w="12240" w:h="15840"/>
       <w:pgMar w:top="1440" w:right="1800" w:bottom="1440" w:left="1800" w:header="720" w:footer="720" w:gutter="0"/>
       <w:cols w:space="720"/>

</xml_diff>